<commit_message>
Updated with new results (until model v3_1)
</commit_message>
<xml_diff>
--- a/.notes/Training_history_graphs.docx
+++ b/.notes/Training_history_graphs.docx
@@ -4,16 +4,13 @@
   <w:body>
     <w:p>
       <w:r>
-        <w:t>../.models/dae_ssim_</w:t>
-      </w:r>
-      <w:r>
-        <w:t>v</w:t>
-      </w:r>
-      <w:r>
-        <w:t>2</w:t>
-      </w:r>
-      <w:r>
-        <w:t>_masks.keras</w:t>
+        <w:t>../.models/dae_ssim_v2_masks.keras</w:t>
+      </w:r>
+      <w:r>
+        <w:t xml:space="preserve"> (delet</w:t>
+      </w:r>
+      <w:r>
+        <w:t>ed)</w:t>
       </w:r>
     </w:p>
     <w:p>
@@ -172,16 +169,60 @@
       </w:r>
     </w:p>
     <w:p>
-      <w:r>
+      <w:pPr>
+        <w:rPr>
+          <w:lang w:val="es-CO"/>
+        </w:rPr>
+      </w:pPr>
+      <w:proofErr w:type="gramStart"/>
+      <w:r>
+        <w:rPr>
+          <w:lang w:val="es-CO"/>
+        </w:rPr>
         <w:lastRenderedPageBreak/>
-        <w:t>../.models/dae_ssim_</w:t>
-      </w:r>
-      <w:r>
-        <w:t>v2-1</w:t>
-      </w:r>
-      <w:r>
-        <w:t>_masks.keras</w:t>
-      </w:r>
+        <w:t>../.</w:t>
+      </w:r>
+      <w:proofErr w:type="spellStart"/>
+      <w:r>
+        <w:rPr>
+          <w:lang w:val="es-CO"/>
+        </w:rPr>
+        <w:t>models</w:t>
+      </w:r>
+      <w:proofErr w:type="spellEnd"/>
+      <w:proofErr w:type="gramEnd"/>
+      <w:r>
+        <w:rPr>
+          <w:lang w:val="es-CO"/>
+        </w:rPr>
+        <w:t>/</w:t>
+      </w:r>
+      <w:r>
+        <w:rPr>
+          <w:lang w:val="es-CO"/>
+        </w:rPr>
+        <w:t xml:space="preserve"> </w:t>
+      </w:r>
+      <w:r>
+        <w:rPr>
+          <w:lang w:val="es-CO"/>
+        </w:rPr>
+        <w:t>v2_dae_mae_</w:t>
+      </w:r>
+      <w:proofErr w:type="gramStart"/>
+      <w:r>
+        <w:rPr>
+          <w:lang w:val="es-CO"/>
+        </w:rPr>
+        <w:t>mask</w:t>
+      </w:r>
+      <w:r>
+        <w:rPr>
+          <w:lang w:val="es-CO"/>
+        </w:rPr>
+        <w:t>.keras</w:t>
+      </w:r>
+      <w:proofErr w:type="gramEnd"/>
     </w:p>
     <w:p>
       <w:r>
@@ -238,7 +279,133 @@
         </w:drawing>
       </w:r>
     </w:p>
-    <w:p/>
+    <w:p>
+      <w:r>
+        <w:br w:type="page"/>
+      </w:r>
+    </w:p>
+    <w:p>
+      <w:r>
+        <w:lastRenderedPageBreak/>
+        <w:t>v3_dae_mae_ssim_mask</w:t>
+      </w:r>
+      <w:r>
+        <w:t>:</w:t>
+      </w:r>
+    </w:p>
+    <w:p>
+      <w:r>
+        <w:drawing>
+          <wp:inline distT="0" distB="0" distL="0" distR="0" wp14:anchorId="1A5A5E25" wp14:editId="1C60DB56">
+            <wp:extent cx="5943600" cy="4042410"/>
+            <wp:effectExtent l="0" t="0" r="0" b="0"/>
+            <wp:docPr id="1537628576" name="Picture 1"/>
+            <wp:cNvGraphicFramePr>
+              <a:graphicFrameLocks xmlns:a="http://schemas.openxmlformats.org/drawingml/2006/main" noChangeAspect="1"/>
+            </wp:cNvGraphicFramePr>
+            <a:graphic xmlns:a="http://schemas.openxmlformats.org/drawingml/2006/main">
+              <a:graphicData uri="http://schemas.openxmlformats.org/drawingml/2006/picture">
+                <pic:pic xmlns:pic="http://schemas.openxmlformats.org/drawingml/2006/picture">
+                  <pic:nvPicPr>
+                    <pic:cNvPr id="1537628576" name=""/>
+                    <pic:cNvPicPr/>
+                  </pic:nvPicPr>
+                  <pic:blipFill>
+                    <a:blip r:embed="rId6"/>
+                    <a:stretch>
+                      <a:fillRect/>
+                    </a:stretch>
+                  </pic:blipFill>
+                  <pic:spPr>
+                    <a:xfrm>
+                      <a:off x="0" y="0"/>
+                      <a:ext cx="5943600" cy="4042410"/>
+                    </a:xfrm>
+                    <a:prstGeom prst="rect">
+                      <a:avLst/>
+                    </a:prstGeom>
+                  </pic:spPr>
+                </pic:pic>
+              </a:graphicData>
+            </a:graphic>
+          </wp:inline>
+        </w:drawing>
+      </w:r>
+    </w:p>
+    <w:p>
+      <w:r>
+        <w:br w:type="page"/>
+      </w:r>
+    </w:p>
+    <w:p>
+      <w:pPr>
+        <w:rPr>
+          <w:noProof/>
+        </w:rPr>
+      </w:pPr>
+      <w:r>
+        <w:rPr>
+          <w:noProof/>
+        </w:rPr>
+        <w:lastRenderedPageBreak/>
+        <w:t>v3_1_dae_mae_mask_ssim_unmask</w:t>
+      </w:r>
+    </w:p>
+    <w:p>
+      <w:r>
+        <w:rPr>
+          <w:noProof/>
+        </w:rPr>
+        <w:drawing>
+          <wp:inline distT="0" distB="0" distL="0" distR="0" wp14:anchorId="47F21C93" wp14:editId="48BD9646">
+            <wp:extent cx="5943600" cy="4222750"/>
+            <wp:effectExtent l="0" t="0" r="0" b="6350"/>
+            <wp:docPr id="275612061" name="Picture 1"/>
+            <wp:cNvGraphicFramePr>
+              <a:graphicFrameLocks xmlns:a="http://schemas.openxmlformats.org/drawingml/2006/main" noChangeAspect="1"/>
+            </wp:cNvGraphicFramePr>
+            <a:graphic xmlns:a="http://schemas.openxmlformats.org/drawingml/2006/main">
+              <a:graphicData uri="http://schemas.openxmlformats.org/drawingml/2006/picture">
+                <pic:pic xmlns:pic="http://schemas.openxmlformats.org/drawingml/2006/picture">
+                  <pic:nvPicPr>
+                    <pic:cNvPr id="0" name="Picture 1"/>
+                    <pic:cNvPicPr>
+                      <a:picLocks noChangeAspect="1" noChangeArrowheads="1"/>
+                    </pic:cNvPicPr>
+                  </pic:nvPicPr>
+                  <pic:blipFill>
+                    <a:blip r:embed="rId7">
+                      <a:extLst>
+                        <a:ext uri="{28A0092B-C50C-407E-A947-70E740481C1C}">
+                          <a14:useLocalDpi xmlns:a14="http://schemas.microsoft.com/office/drawing/2010/main" val="0"/>
+                        </a:ext>
+                      </a:extLst>
+                    </a:blip>
+                    <a:srcRect/>
+                    <a:stretch>
+                      <a:fillRect/>
+                    </a:stretch>
+                  </pic:blipFill>
+                  <pic:spPr bwMode="auto">
+                    <a:xfrm>
+                      <a:off x="0" y="0"/>
+                      <a:ext cx="5943600" cy="4222750"/>
+                    </a:xfrm>
+                    <a:prstGeom prst="rect">
+                      <a:avLst/>
+                    </a:prstGeom>
+                    <a:noFill/>
+                    <a:ln>
+                      <a:noFill/>
+                    </a:ln>
+                  </pic:spPr>
+                </pic:pic>
+              </a:graphicData>
+            </a:graphic>
+          </wp:inline>
+        </w:drawing>
+      </w:r>
+    </w:p>
     <w:sectPr>
       <w:pgSz w:w="12240" w:h="15840"/>
       <w:pgMar w:top="720" w:right="1440" w:bottom="720" w:left="1440" w:header="708" w:footer="708" w:gutter="0"/>

</xml_diff>

<commit_message>
Updated results until model "v4_2_dae_mae_ssim_weight07_mask"
</commit_message>
<xml_diff>
--- a/.notes/Training_history_graphs.docx
+++ b/.notes/Training_history_graphs.docx
@@ -70,97 +70,27 @@
     </w:p>
     <w:p>
       <w:r>
-        <w:t xml:space="preserve">Typo with the </w:t>
-      </w:r>
-      <w:proofErr w:type="spellStart"/>
-      <w:r>
-        <w:t>val</w:t>
-      </w:r>
-      <w:proofErr w:type="spellEnd"/>
-      <w:r>
-        <w:t xml:space="preserve"> set:</w:t>
+        <w:t>Typo with the val set:</w:t>
       </w:r>
       <w:r>
         <w:br/>
       </w:r>
-      <w:proofErr w:type="spellStart"/>
-      <w:r>
-        <w:t>train_ds</w:t>
-      </w:r>
-      <w:proofErr w:type="spellEnd"/>
-      <w:r>
-        <w:t xml:space="preserve"> = </w:t>
-      </w:r>
-      <w:proofErr w:type="spellStart"/>
-      <w:r>
-        <w:t>create_</w:t>
-      </w:r>
-      <w:proofErr w:type="gramStart"/>
-      <w:r>
-        <w:t>dataset</w:t>
-      </w:r>
-      <w:proofErr w:type="spellEnd"/>
-      <w:r>
-        <w:t>(</w:t>
-      </w:r>
-      <w:proofErr w:type="spellStart"/>
-      <w:proofErr w:type="gramEnd"/>
-      <w:r>
-        <w:t>train_img_paths</w:t>
-      </w:r>
-      <w:proofErr w:type="spellEnd"/>
-      <w:r>
-        <w:t xml:space="preserve">, </w:t>
-      </w:r>
-      <w:proofErr w:type="spellStart"/>
-      <w:r>
-        <w:t>train_mask_paths</w:t>
-      </w:r>
-      <w:proofErr w:type="spellEnd"/>
-      <w:r>
-        <w:t>, shuffle=True,)</w:t>
-      </w:r>
-    </w:p>
-    <w:p>
-      <w:proofErr w:type="spellStart"/>
-      <w:r>
-        <w:t>val_ds</w:t>
-      </w:r>
-      <w:proofErr w:type="spellEnd"/>
-      <w:r>
-        <w:t xml:space="preserve"> = </w:t>
-      </w:r>
-      <w:proofErr w:type="spellStart"/>
-      <w:r>
-        <w:t>create_</w:t>
-      </w:r>
-      <w:proofErr w:type="gramStart"/>
-      <w:r>
-        <w:t>dataset</w:t>
-      </w:r>
-      <w:proofErr w:type="spellEnd"/>
-      <w:r>
-        <w:t>(</w:t>
-      </w:r>
-      <w:proofErr w:type="spellStart"/>
-      <w:proofErr w:type="gramEnd"/>
+      <w:r>
+        <w:t>train_ds = create_dataset(train_img_paths, train_mask_paths, shuffle=True,)</w:t>
+      </w:r>
+    </w:p>
+    <w:p>
+      <w:r>
+        <w:t>val_ds = create_dataset(</w:t>
+      </w:r>
       <w:r>
         <w:rPr>
           <w:highlight w:val="red"/>
         </w:rPr>
         <w:t>val_mask_paths</w:t>
       </w:r>
-      <w:proofErr w:type="spellEnd"/>
-      <w:r>
-        <w:t xml:space="preserve">, </w:t>
-      </w:r>
-      <w:proofErr w:type="spellStart"/>
-      <w:r>
-        <w:t>val_mask_paths</w:t>
-      </w:r>
-      <w:proofErr w:type="spellEnd"/>
-      <w:r>
-        <w:t>, shuffle=False,)</w:t>
+      <w:r>
+        <w:t>, val_mask_paths, shuffle=False,)</w:t>
       </w:r>
     </w:p>
     <w:p>
@@ -174,28 +104,12 @@
           <w:lang w:val="es-CO"/>
         </w:rPr>
       </w:pPr>
-      <w:proofErr w:type="gramStart"/>
       <w:r>
         <w:rPr>
           <w:lang w:val="es-CO"/>
         </w:rPr>
         <w:lastRenderedPageBreak/>
-        <w:t>../.</w:t>
-      </w:r>
-      <w:proofErr w:type="spellStart"/>
-      <w:r>
-        <w:rPr>
-          <w:lang w:val="es-CO"/>
-        </w:rPr>
-        <w:t>models</w:t>
-      </w:r>
-      <w:proofErr w:type="spellEnd"/>
-      <w:proofErr w:type="gramEnd"/>
-      <w:r>
-        <w:rPr>
-          <w:lang w:val="es-CO"/>
-        </w:rPr>
-        <w:t>/</w:t>
+        <w:t>../.models/</w:t>
       </w:r>
       <w:r>
         <w:rPr>
@@ -207,14 +121,7 @@
         <w:rPr>
           <w:lang w:val="es-CO"/>
         </w:rPr>
-        <w:t>v2_dae_mae_</w:t>
-      </w:r>
-      <w:proofErr w:type="gramStart"/>
-      <w:r>
-        <w:rPr>
-          <w:lang w:val="es-CO"/>
-        </w:rPr>
-        <w:t>mask</w:t>
+        <w:t>v2_dae_mae_mask</w:t>
       </w:r>
       <w:r>
         <w:rPr>
@@ -222,7 +129,6 @@
         </w:rPr>
         <w:t>.keras</w:t>
       </w:r>
-      <w:proofErr w:type="gramEnd"/>
     </w:p>
     <w:p>
       <w:r>
@@ -333,6 +239,11 @@
       </w:r>
     </w:p>
     <w:p>
+      <w:pPr>
+        <w:rPr>
+          <w:lang w:val="es-CO"/>
+        </w:rPr>
+      </w:pPr>
       <w:r>
         <w:br w:type="page"/>
       </w:r>
@@ -398,6 +309,140 @@
                     <a:ln>
                       <a:noFill/>
                     </a:ln>
+                  </pic:spPr>
+                </pic:pic>
+              </a:graphicData>
+            </a:graphic>
+          </wp:inline>
+        </w:drawing>
+      </w:r>
+    </w:p>
+    <w:p>
+      <w:r>
+        <w:br w:type="page"/>
+      </w:r>
+    </w:p>
+    <w:p>
+      <w:r>
+        <w:lastRenderedPageBreak/>
+        <w:t>v4_dae_mae_ssim_weight</w:t>
+      </w:r>
+      <w:r>
+        <w:t>04</w:t>
+      </w:r>
+      <w:r>
+        <w:t>_mask</w:t>
+      </w:r>
+      <w:r>
+        <w:t xml:space="preserve"> → weight 0.40</w:t>
+      </w:r>
+    </w:p>
+    <w:p>
+      <w:r>
+        <w:rPr>
+          <w:noProof/>
+        </w:rPr>
+        <w:drawing>
+          <wp:inline distT="0" distB="0" distL="0" distR="0" wp14:anchorId="0892F72A" wp14:editId="654F160B">
+            <wp:extent cx="5943600" cy="4222750"/>
+            <wp:effectExtent l="0" t="0" r="0" b="6350"/>
+            <wp:docPr id="321660753" name="Picture 2"/>
+            <wp:cNvGraphicFramePr>
+              <a:graphicFrameLocks xmlns:a="http://schemas.openxmlformats.org/drawingml/2006/main" noChangeAspect="1"/>
+            </wp:cNvGraphicFramePr>
+            <a:graphic xmlns:a="http://schemas.openxmlformats.org/drawingml/2006/main">
+              <a:graphicData uri="http://schemas.openxmlformats.org/drawingml/2006/picture">
+                <pic:pic xmlns:pic="http://schemas.openxmlformats.org/drawingml/2006/picture">
+                  <pic:nvPicPr>
+                    <pic:cNvPr id="0" name="Picture 3"/>
+                    <pic:cNvPicPr>
+                      <a:picLocks noChangeAspect="1" noChangeArrowheads="1"/>
+                    </pic:cNvPicPr>
+                  </pic:nvPicPr>
+                  <pic:blipFill>
+                    <a:blip r:embed="rId8">
+                      <a:extLst>
+                        <a:ext uri="{28A0092B-C50C-407E-A947-70E740481C1C}">
+                          <a14:useLocalDpi xmlns:a14="http://schemas.microsoft.com/office/drawing/2010/main" val="0"/>
+                        </a:ext>
+                      </a:extLst>
+                    </a:blip>
+                    <a:srcRect/>
+                    <a:stretch>
+                      <a:fillRect/>
+                    </a:stretch>
+                  </pic:blipFill>
+                  <pic:spPr bwMode="auto">
+                    <a:xfrm>
+                      <a:off x="0" y="0"/>
+                      <a:ext cx="5943600" cy="4222750"/>
+                    </a:xfrm>
+                    <a:prstGeom prst="rect">
+                      <a:avLst/>
+                    </a:prstGeom>
+                    <a:noFill/>
+                    <a:ln>
+                      <a:noFill/>
+                    </a:ln>
+                  </pic:spPr>
+                </pic:pic>
+              </a:graphicData>
+            </a:graphic>
+          </wp:inline>
+        </w:drawing>
+      </w:r>
+    </w:p>
+    <w:p>
+      <w:r>
+        <w:br w:type="page"/>
+      </w:r>
+    </w:p>
+    <w:p>
+      <w:r>
+        <w:lastRenderedPageBreak/>
+        <w:t>v4_dae_mae_ssim_weight</w:t>
+      </w:r>
+      <w:r>
+        <w:t>07</w:t>
+      </w:r>
+      <w:r>
+        <w:t>_mask</w:t>
+      </w:r>
+      <w:r>
+        <w:t xml:space="preserve"> → weight 0.70</w:t>
+      </w:r>
+    </w:p>
+    <w:p>
+      <w:r>
+        <w:drawing>
+          <wp:inline distT="0" distB="0" distL="0" distR="0" wp14:anchorId="193ED144" wp14:editId="60CC3B12">
+            <wp:extent cx="5943600" cy="4223385"/>
+            <wp:effectExtent l="0" t="0" r="0" b="5715"/>
+            <wp:docPr id="2057885483" name="Picture 1"/>
+            <wp:cNvGraphicFramePr>
+              <a:graphicFrameLocks xmlns:a="http://schemas.openxmlformats.org/drawingml/2006/main" noChangeAspect="1"/>
+            </wp:cNvGraphicFramePr>
+            <a:graphic xmlns:a="http://schemas.openxmlformats.org/drawingml/2006/main">
+              <a:graphicData uri="http://schemas.openxmlformats.org/drawingml/2006/picture">
+                <pic:pic xmlns:pic="http://schemas.openxmlformats.org/drawingml/2006/picture">
+                  <pic:nvPicPr>
+                    <pic:cNvPr id="2057885483" name=""/>
+                    <pic:cNvPicPr/>
+                  </pic:nvPicPr>
+                  <pic:blipFill>
+                    <a:blip r:embed="rId9"/>
+                    <a:stretch>
+                      <a:fillRect/>
+                    </a:stretch>
+                  </pic:blipFill>
+                  <pic:spPr>
+                    <a:xfrm>
+                      <a:off x="0" y="0"/>
+                      <a:ext cx="5943600" cy="4223385"/>
+                    </a:xfrm>
+                    <a:prstGeom prst="rect">
+                      <a:avLst/>
+                    </a:prstGeom>
                   </pic:spPr>
                 </pic:pic>
               </a:graphicData>

</xml_diff>